<commit_message>
Update PRD: add multi-currency support with Nigerian-first positioning
</commit_message>
<xml_diff>
--- a/MYNAIRATRACK 001-PRODUCT REQUIREMENTS DOCUMENT.docx
+++ b/MYNAIRATRACK 001-PRODUCT REQUIREMENTS DOCUMENT.docx
@@ -132,6 +132,27 @@
       </w:pPr>
       <w:r>
         <w:rPr>
+          <w:b/>
+          <w:bCs/>
+          <w:lang w:val="en-NG"/>
+        </w:rPr>
+        <w:t xml:space="preserve">Primary/Default Currency: </w:t>
+      </w:r>
+      <w:r>
+        <w:rPr>
+          <w:lang w:val="en-NG"/>
+        </w:rPr>
+        <w:t xml:space="preserve">NGN (users can choose their own primary currency)</w:t>
+      </w:r>
+    </w:p>
+    <w:p>
+      <w:pPr>
+        <w:rPr>
+          <w:lang w:val="en-NG"/>
+        </w:rPr>
+      </w:pPr>
+      <w:r>
+        <w:rPr>
           <w:lang w:val="en-NG"/>
         </w:rPr>
         <w:pict w14:anchorId="500C9C1D">
@@ -349,6 +370,19 @@
         <w:rPr>
           <w:lang w:val="en-NG"/>
         </w:rPr>
+        <w:t xml:space="preserve">Support money in multiple currencies</w:t>
+      </w:r>
+    </w:p>
+    <w:p>
+      <w:pPr>
+        <w:rPr>
+          <w:lang w:val="en-NG"/>
+        </w:rPr>
+      </w:pPr>
+      <w:r>
+        <w:rPr>
+          <w:lang w:val="en-NG"/>
+        </w:rPr>
         <w:t xml:space="preserve">The product will prioritize </w:t>
       </w:r>
       <w:r>
@@ -364,6 +398,19 @@
           <w:lang w:val="en-NG"/>
         </w:rPr>
         <w:t>, helping users make better decisions based on their actual financial activity.</w:t>
+      </w:r>
+    </w:p>
+    <w:p>
+      <w:pPr>
+        <w:rPr>
+          <w:lang w:val="en-NG"/>
+        </w:rPr>
+      </w:pPr>
+      <w:r>
+        <w:rPr>
+          <w:lang w:val="en-NG"/>
+        </w:rPr>
+        <w:t xml:space="preserve">MYNAIRATRACK is Nigeria-first. It will also support users who earn or spend in multiple currencies, so that people outside Nigeria can use the product with their own primary currency. Nigeria remains the initial primary market.</w:t>
       </w:r>
     </w:p>
     <w:p>
@@ -605,6 +652,32 @@
         <w:rPr>
           <w:lang w:val="en-NG"/>
         </w:rPr>
+        <w:t xml:space="preserve">Difficulty managing money across multiple currencies</w:t>
+      </w:r>
+    </w:p>
+    <w:p>
+      <w:pPr>
+        <w:rPr>
+          <w:lang w:val="en-NG"/>
+        </w:rPr>
+      </w:pPr>
+      <w:r>
+        <w:rPr>
+          <w:lang w:val="en-NG"/>
+        </w:rPr>
+        <w:t xml:space="preserve">Difficulty tracking income, expenses, and budgets in more than one currency</w:t>
+      </w:r>
+    </w:p>
+    <w:p>
+      <w:pPr>
+        <w:rPr>
+          <w:lang w:val="en-NG"/>
+        </w:rPr>
+      </w:pPr>
+      <w:r>
+        <w:rPr>
+          <w:lang w:val="en-NG"/>
+        </w:rPr>
         <w:t>MYNAIRATRACK aims to address these problems by giving users a clear and organized view of their finances.</w:t>
       </w:r>
     </w:p>
@@ -650,7 +723,7 @@
         <w:rPr>
           <w:lang w:val="en-NG"/>
         </w:rPr>
-        <w:t>To become a simple and practical financial management companion that helps people understand where their money goes, plan how to use it, control their spending, and build healthier financial habits.</w:t>
+        <w:t>To become a simple and practical financial management companion that helps people understand where their money goes, plan how to use it, control their spending, and build healthier financial habits, including for users who earn or spend in more than one currency.</w:t>
       </w:r>
     </w:p>
     <w:p>
@@ -717,7 +790,7 @@
           <w:bCs/>
           <w:lang w:val="en-NG"/>
         </w:rPr>
-        <w:t>understanding, planning, tracking, and managing their money</w:t>
+        <w:t>understanding, planning, tracking, and managing their money, including money held in more than one currency where needed</w:t>
       </w:r>
       <w:r>
         <w:rPr>
@@ -1112,6 +1185,127 @@
     <w:p>
       <w:pPr>
         <w:rPr>
+          <w:b/>
+          <w:bCs/>
+          <w:lang w:val="en-NG"/>
+        </w:rPr>
+      </w:pPr>
+      <w:r>
+        <w:rPr>
+          <w:b/>
+          <w:bCs/>
+          <w:lang w:val="en-NG"/>
+        </w:rPr>
+        <w:t xml:space="preserve">Multi-Currency Users</w:t>
+      </w:r>
+    </w:p>
+    <w:p>
+      <w:pPr>
+        <w:rPr>
+          <w:lang w:val="en-NG"/>
+        </w:rPr>
+      </w:pPr>
+      <w:r>
+        <w:rPr>
+          <w:lang w:val="en-NG"/>
+        </w:rPr>
+        <w:t xml:space="preserve">Multi-currency support can also benefit:</w:t>
+      </w:r>
+    </w:p>
+    <w:p>
+      <w:pPr>
+        <w:rPr>
+          <w:lang w:val="en-NG"/>
+        </w:rPr>
+      </w:pPr>
+      <w:r>
+        <w:rPr>
+          <w:lang w:val="en-NG"/>
+        </w:rPr>
+        <w:t xml:space="preserve">Freelancers receiving foreign payments</w:t>
+      </w:r>
+    </w:p>
+    <w:p>
+      <w:pPr>
+        <w:rPr>
+          <w:lang w:val="en-NG"/>
+        </w:rPr>
+      </w:pPr>
+      <w:r>
+        <w:rPr>
+          <w:lang w:val="en-NG"/>
+        </w:rPr>
+        <w:t xml:space="preserve">Remote workers</w:t>
+      </w:r>
+    </w:p>
+    <w:p>
+      <w:pPr>
+        <w:rPr>
+          <w:lang w:val="en-NG"/>
+        </w:rPr>
+      </w:pPr>
+      <w:r>
+        <w:rPr>
+          <w:lang w:val="en-NG"/>
+        </w:rPr>
+        <w:t xml:space="preserve">People with foreign-currency accounts</w:t>
+      </w:r>
+    </w:p>
+    <w:p>
+      <w:pPr>
+        <w:rPr>
+          <w:lang w:val="en-NG"/>
+        </w:rPr>
+      </w:pPr>
+      <w:r>
+        <w:rPr>
+          <w:lang w:val="en-NG"/>
+        </w:rPr>
+        <w:t xml:space="preserve">Travelers</w:t>
+      </w:r>
+    </w:p>
+    <w:p>
+      <w:pPr>
+        <w:rPr>
+          <w:lang w:val="en-NG"/>
+        </w:rPr>
+      </w:pPr>
+      <w:r>
+        <w:rPr>
+          <w:lang w:val="en-NG"/>
+        </w:rPr>
+        <w:t xml:space="preserve">People who earn or spend in multiple currencies</w:t>
+      </w:r>
+    </w:p>
+    <w:p>
+      <w:pPr>
+        <w:rPr>
+          <w:lang w:val="en-NG"/>
+        </w:rPr>
+      </w:pPr>
+      <w:r>
+        <w:rPr>
+          <w:lang w:val="en-NG"/>
+        </w:rPr>
+        <w:t xml:space="preserve">Small businesses with international transactions</w:t>
+      </w:r>
+    </w:p>
+    <w:p>
+      <w:pPr>
+        <w:rPr>
+          <w:lang w:val="en-NG"/>
+        </w:rPr>
+      </w:pPr>
+      <w:r>
+        <w:rPr>
+          <w:lang w:val="en-NG"/>
+        </w:rPr>
+        <w:t xml:space="preserve">These additional users benefit from multi-currency support without replacing the existing Nigerian-first target audience.</w:t>
+      </w:r>
+    </w:p>
+    <w:p>
+      <w:pPr>
+        <w:rPr>
           <w:lang w:val="en-NG"/>
         </w:rPr>
       </w:pPr>
@@ -1715,6 +1909,58 @@
         <w:rPr>
           <w:lang w:val="en-NG"/>
         </w:rPr>
+        <w:t xml:space="preserve">The app should have one main dashboard, not a separate dashboard for every currency.</w:t>
+      </w:r>
+    </w:p>
+    <w:p>
+      <w:pPr>
+        <w:rPr>
+          <w:lang w:val="en-NG"/>
+        </w:rPr>
+      </w:pPr>
+      <w:r>
+        <w:rPr>
+          <w:lang w:val="en-NG"/>
+        </w:rPr>
+        <w:t xml:space="preserve">The dashboard should primarily display the user's selected primary currency.</w:t>
+      </w:r>
+    </w:p>
+    <w:p>
+      <w:pPr>
+        <w:rPr>
+          <w:lang w:val="en-NG"/>
+        </w:rPr>
+      </w:pPr>
+      <w:r>
+        <w:rPr>
+          <w:lang w:val="en-NG"/>
+        </w:rPr>
+        <w:t xml:space="preserve">A currency selector/filter should allow the user to view their financial information in a specific currency, including an All Currencies view.</w:t>
+      </w:r>
+    </w:p>
+    <w:p>
+      <w:pPr>
+        <w:rPr>
+          <w:lang w:val="en-NG"/>
+        </w:rPr>
+      </w:pPr>
+      <w:r>
+        <w:rPr>
+          <w:lang w:val="en-NG"/>
+        </w:rPr>
+        <w:t xml:space="preserve">The interface should remain simple and uncluttered, without showing multiple currencies unnecessarily on the main dashboard.</w:t>
+      </w:r>
+    </w:p>
+    <w:p>
+      <w:pPr>
+        <w:rPr>
+          <w:lang w:val="en-NG"/>
+        </w:rPr>
+      </w:pPr>
+      <w:r>
+        <w:rPr>
+          <w:lang w:val="en-NG"/>
+        </w:rPr>
         <w:pict w14:anchorId="52496835">
           <v:rect id="_x0000_i1201" style="width:0;height:1.5pt" o:hralign="center" o:hrstd="t" o:hr="t" fillcolor="#a0a0a0" stroked="f"/>
         </w:pict>
@@ -2071,6 +2317,19 @@
         <w:rPr>
           <w:lang w:val="en-NG"/>
         </w:rPr>
+        <w:t xml:space="preserve">Each income record should also capture the relevant currency. For example: Salary - â</w:t>
+      </w:r>
+    </w:p>
+    <w:p>
+      <w:pPr>
+        <w:rPr>
+          <w:lang w:val="en-NG"/>
+        </w:rPr>
+      </w:pPr>
+      <w:r>
+        <w:rPr>
+          <w:lang w:val="en-NG"/>
+        </w:rPr>
         <w:pict w14:anchorId="652F88D3">
           <v:rect id="_x0000_i1202" style="width:0;height:1.5pt" o:hralign="center" o:hrstd="t" o:hr="t" fillcolor="#a0a0a0" stroked="f"/>
         </w:pict>
@@ -2594,6 +2853,19 @@
         <w:rPr>
           <w:lang w:val="en-NG"/>
         </w:rPr>
+        <w:t xml:space="preserve">Each budget should have its own selected currency. A budget is not required to use the currency of a specific account/wallet. The user's primary currency can be the default for budgets, but users should be able to create a budget in another supported currency where appropriate.</w:t>
+      </w:r>
+    </w:p>
+    <w:p>
+      <w:pPr>
+        <w:rPr>
+          <w:lang w:val="en-NG"/>
+        </w:rPr>
+      </w:pPr>
+      <w:r>
+        <w:rPr>
+          <w:lang w:val="en-NG"/>
+        </w:rPr>
         <w:pict w14:anchorId="1B0117B3">
           <v:rect id="_x0000_i1204" style="width:0;height:1.5pt" o:hralign="center" o:hrstd="t" o:hr="t" fillcolor="#a0a0a0" stroked="f"/>
         </w:pict>
@@ -2915,6 +3187,19 @@
         <w:rPr>
           <w:lang w:val="en-NG"/>
         </w:rPr>
+        <w:t xml:space="preserve">Budget monitoring should be shown in the budget's selected currency.</w:t>
+      </w:r>
+    </w:p>
+    <w:p>
+      <w:pPr>
+        <w:rPr>
+          <w:lang w:val="en-NG"/>
+        </w:rPr>
+      </w:pPr>
+      <w:r>
+        <w:rPr>
+          <w:lang w:val="en-NG"/>
+        </w:rPr>
         <w:pict w14:anchorId="0346CBBE">
           <v:rect id="_x0000_i1206" style="width:0;height:1.5pt" o:hralign="center" o:hrstd="t" o:hr="t" fillcolor="#a0a0a0" stroked="f"/>
         </w:pict>
@@ -3321,6 +3606,19 @@
         <w:rPr>
           <w:lang w:val="en-NG"/>
         </w:rPr>
+        <w:t xml:space="preserve">Savings should be tracked in the relevant currency, and a savings target should be set in a specific currency.</w:t>
+      </w:r>
+    </w:p>
+    <w:p>
+      <w:pPr>
+        <w:rPr>
+          <w:lang w:val="en-NG"/>
+        </w:rPr>
+      </w:pPr>
+      <w:r>
+        <w:rPr>
+          <w:lang w:val="en-NG"/>
+        </w:rPr>
         <w:pict w14:anchorId="0DD832EA">
           <v:rect id="_x0000_i1209" style="width:0;height:1.5pt" o:hralign="center" o:hrstd="t" o:hr="t" fillcolor="#a0a0a0" stroked="f"/>
         </w:pict>
@@ -3671,6 +3969,19 @@
         <w:rPr>
           <w:lang w:val="en-NG"/>
         </w:rPr>
+        <w:t xml:space="preserve">Each financial goal should have its target amount in a specific currency.</w:t>
+      </w:r>
+    </w:p>
+    <w:p>
+      <w:pPr>
+        <w:rPr>
+          <w:lang w:val="en-NG"/>
+        </w:rPr>
+      </w:pPr>
+      <w:r>
+        <w:rPr>
+          <w:lang w:val="en-NG"/>
+        </w:rPr>
         <w:pict w14:anchorId="3A260483">
           <v:rect id="_x0000_i1210" style="width:0;height:1.5pt" o:hralign="center" o:hrstd="t" o:hr="t" fillcolor="#a0a0a0" stroked="f"/>
         </w:pict>
@@ -3931,6 +4242,19 @@
         <w:rPr>
           <w:lang w:val="en-NG"/>
         </w:rPr>
+        <w:t xml:space="preserve">Business accounts/wallets can also have their own currency. Sales, business income, business expenses, business budgets, profit, and business transaction history can be tracked in the relevant currency, while remaining separate from personal finances.</w:t>
+      </w:r>
+    </w:p>
+    <w:p>
+      <w:pPr>
+        <w:rPr>
+          <w:lang w:val="en-NG"/>
+        </w:rPr>
+      </w:pPr>
+      <w:r>
+        <w:rPr>
+          <w:lang w:val="en-NG"/>
+        </w:rPr>
         <w:pict w14:anchorId="5F87F6B2">
           <v:rect id="_x0000_i1211" style="width:0;height:1.5pt" o:hralign="center" o:hrstd="t" o:hr="t" fillcolor="#a0a0a0" stroked="f"/>
         </w:pict>
@@ -3950,6 +4274,192 @@
           <w:bCs/>
           <w:lang w:val="en-NG"/>
         </w:rPr>
+        <w:t xml:space="preserve">8.12 Multi-Currency Support</w:t>
+      </w:r>
+    </w:p>
+    <w:p>
+      <w:pPr>
+        <w:rPr>
+          <w:lang w:val="en-NG"/>
+        </w:rPr>
+      </w:pPr>
+      <w:r>
+        <w:rPr>
+          <w:lang w:val="en-NG"/>
+        </w:rPr>
+        <w:t xml:space="preserve">NGN should be the initial/default currency because the product is Nigeria-first.</w:t>
+      </w:r>
+    </w:p>
+    <w:p>
+      <w:pPr>
+        <w:rPr>
+          <w:lang w:val="en-NG"/>
+        </w:rPr>
+      </w:pPr>
+      <w:r>
+        <w:rPr>
+          <w:lang w:val="en-NG"/>
+        </w:rPr>
+        <w:t xml:space="preserve">Users must be able to choose their own primary/default currency during onboarding or from settings.</w:t>
+      </w:r>
+    </w:p>
+    <w:p>
+      <w:pPr>
+        <w:rPr>
+          <w:lang w:val="en-NG"/>
+        </w:rPr>
+      </w:pPr>
+      <w:r>
+        <w:rPr>
+          <w:lang w:val="en-NG"/>
+        </w:rPr>
+        <w:t xml:space="preserve">Users should be able to add and use additional supported currencies. For example, a user whose primary currency is NGN could also add USD and EUR.</w:t>
+      </w:r>
+    </w:p>
+    <w:p>
+      <w:pPr>
+        <w:rPr>
+          <w:lang w:val="en-NG"/>
+        </w:rPr>
+      </w:pPr>
+      <w:r>
+        <w:rPr>
+          <w:lang w:val="en-NG"/>
+        </w:rPr>
+        <w:t xml:space="preserve">The product should support recording income, expenses, budgets, savings, and financial goals in the relevant currency.</w:t>
+      </w:r>
+    </w:p>
+    <w:p>
+      <w:pPr>
+        <w:rPr>
+          <w:lang w:val="en-NG"/>
+        </w:rPr>
+      </w:pPr>
+      <w:r>
+        <w:rPr>
+          <w:lang w:val="en-NG"/>
+        </w:rPr>
+        <w:t xml:space="preserve">Every transaction must retain its original currency. For example:</w:t>
+      </w:r>
+    </w:p>
+    <w:p>
+      <w:pPr>
+        <w:rPr>
+          <w:lang w:val="en-NG"/>
+        </w:rPr>
+      </w:pPr>
+      <w:r>
+        <w:rPr>
+          <w:lang w:val="en-NG"/>
+        </w:rPr>
+        <w:t xml:space="preserve">Salary: +â</w:t>
+      </w:r>
+    </w:p>
+    <w:p>
+      <w:pPr>
+        <w:rPr>
+          <w:lang w:val="en-NG"/>
+        </w:rPr>
+      </w:pPr>
+      <w:r>
+        <w:rPr>
+          <w:lang w:val="en-NG"/>
+        </w:rPr>
+        <w:t xml:space="preserve">The original transaction amount should not be automatically replaced with a converted amount.</w:t>
+      </w:r>
+    </w:p>
+    <w:p>
+      <w:pPr>
+        <w:rPr>
+          <w:lang w:val="en-NG"/>
+        </w:rPr>
+      </w:pPr>
+      <w:r>
+        <w:rPr>
+          <w:lang w:val="en-NG"/>
+        </w:rPr>
+        <w:t xml:space="preserve">Accounts/wallets can have their own currency. For example:</w:t>
+      </w:r>
+    </w:p>
+    <w:p>
+      <w:pPr>
+        <w:rPr>
+          <w:lang w:val="en-NG"/>
+        </w:rPr>
+      </w:pPr>
+      <w:r>
+        <w:rPr>
+          <w:lang w:val="en-NG"/>
+        </w:rPr>
+        <w:t xml:space="preserve">Main Bank Account - NGN</w:t>
+      </w:r>
+    </w:p>
+    <w:p>
+      <w:pPr>
+        <w:rPr>
+          <w:lang w:val="en-NG"/>
+        </w:rPr>
+      </w:pPr>
+      <w:r>
+        <w:rPr>
+          <w:lang w:val="en-NG"/>
+        </w:rPr>
+        <w:t xml:space="preserve">Dollar Account - USD</w:t>
+      </w:r>
+    </w:p>
+    <w:p>
+      <w:pPr>
+        <w:rPr>
+          <w:lang w:val="en-NG"/>
+        </w:rPr>
+      </w:pPr>
+      <w:r>
+        <w:rPr>
+          <w:lang w:val="en-NG"/>
+        </w:rPr>
+        <w:t xml:space="preserve">Euro Account - EUR</w:t>
+      </w:r>
+    </w:p>
+    <w:p>
+      <w:pPr>
+        <w:rPr>
+          <w:lang w:val="en-NG"/>
+        </w:rPr>
+      </w:pPr>
+      <w:r>
+        <w:rPr>
+          <w:lang w:val="en-NG"/>
+        </w:rPr>
+        <w:t xml:space="preserve">This should also work appropriately with Business Mode.</w:t>
+      </w:r>
+    </w:p>
+    <w:p>
+      <w:pPr>
+        <w:rPr>
+          <w:lang w:val="en-NG"/>
+        </w:rPr>
+      </w:pPr>
+      <w:r>
+        <w:rPr>
+          <w:lang w:val="en-NG"/>
+        </w:rPr>
+        <w:t xml:space="preserve">MYNAIRATRACK can display converted equivalents for consolidated financial views. The PRD does not specify how exchange rates are obtained, calculated, or technically implemented.</w:t>
+      </w:r>
+    </w:p>
+    <w:p>
+      <w:pPr>
+        <w:rPr>
+          <w:b/>
+          <w:bCs/>
+          <w:lang w:val="en-NG"/>
+        </w:rPr>
+      </w:pPr>
+      <w:r>
+        <w:rPr>
+          <w:b/>
+          <w:bCs/>
+          <w:lang w:val="en-NG"/>
+        </w:rPr>
         <w:t>9. TRANSACTION CATEGORIES</w:t>
       </w:r>
     </w:p>
@@ -4432,6 +4942,32 @@
         <w:rPr>
           <w:lang w:val="en-NG"/>
         </w:rPr>
+        <w:t xml:space="preserve">By default, the financial overview should display the user's primary currency.</w:t>
+      </w:r>
+    </w:p>
+    <w:p>
+      <w:pPr>
+        <w:rPr>
+          <w:lang w:val="en-NG"/>
+        </w:rPr>
+      </w:pPr>
+      <w:r>
+        <w:rPr>
+          <w:lang w:val="en-NG"/>
+        </w:rPr>
+        <w:t xml:space="preserve">An "All Currencies" view should provide a consolidated overview of the user's finances, showing equivalent values in the user's primary currency. The original currency and amount of each transaction must remain visible in transaction history.</w:t>
+      </w:r>
+    </w:p>
+    <w:p>
+      <w:pPr>
+        <w:rPr>
+          <w:lang w:val="en-NG"/>
+        </w:rPr>
+      </w:pPr>
+      <w:r>
+        <w:rPr>
+          <w:lang w:val="en-NG"/>
+        </w:rPr>
         <w:pict w14:anchorId="4513DFA3">
           <v:rect id="_x0000_i1213" style="width:0;height:1.5pt" o:hralign="center" o:hrstd="t" o:hr="t" fillcolor="#a0a0a0" stroked="f"/>
         </w:pict>
@@ -5001,6 +5537,138 @@
     </w:p>
     <w:p>
       <w:pPr>
+        <w:numPr>
+          <w:ilvl w:val="0"/>
+          <w:numId w:val="18"/>
+        </w:numPr>
+        <w:rPr>
+          <w:lang w:val="en-NG"/>
+        </w:rPr>
+      </w:pPr>
+      <w:r>
+        <w:rPr>
+          <w:lang w:val="en-NG"/>
+        </w:rPr>
+        <w:t xml:space="preserve">Primary currency selection</w:t>
+      </w:r>
+    </w:p>
+    <w:p>
+      <w:pPr>
+        <w:numPr>
+          <w:ilvl w:val="0"/>
+          <w:numId w:val="18"/>
+        </w:numPr>
+        <w:rPr>
+          <w:lang w:val="en-NG"/>
+        </w:rPr>
+      </w:pPr>
+      <w:r>
+        <w:rPr>
+          <w:lang w:val="en-NG"/>
+        </w:rPr>
+        <w:t xml:space="preserve">Support for additional currencies</w:t>
+      </w:r>
+    </w:p>
+    <w:p>
+      <w:pPr>
+        <w:numPr>
+          <w:ilvl w:val="0"/>
+          <w:numId w:val="18"/>
+        </w:numPr>
+        <w:rPr>
+          <w:lang w:val="en-NG"/>
+        </w:rPr>
+      </w:pPr>
+      <w:r>
+        <w:rPr>
+          <w:lang w:val="en-NG"/>
+        </w:rPr>
+        <w:t xml:space="preserve">Currency associated with accounts/wallets</w:t>
+      </w:r>
+    </w:p>
+    <w:p>
+      <w:pPr>
+        <w:numPr>
+          <w:ilvl w:val="0"/>
+          <w:numId w:val="18"/>
+        </w:numPr>
+        <w:rPr>
+          <w:lang w:val="en-NG"/>
+        </w:rPr>
+      </w:pPr>
+      <w:r>
+        <w:rPr>
+          <w:lang w:val="en-NG"/>
+        </w:rPr>
+        <w:t xml:space="preserve">Currency associated with transactions</w:t>
+      </w:r>
+    </w:p>
+    <w:p>
+      <w:pPr>
+        <w:numPr>
+          <w:ilvl w:val="0"/>
+          <w:numId w:val="18"/>
+        </w:numPr>
+        <w:rPr>
+          <w:lang w:val="en-NG"/>
+        </w:rPr>
+      </w:pPr>
+      <w:r>
+        <w:rPr>
+          <w:lang w:val="en-NG"/>
+        </w:rPr>
+        <w:t xml:space="preserve">Currency filtering on the dashboard</w:t>
+      </w:r>
+    </w:p>
+    <w:p>
+      <w:pPr>
+        <w:numPr>
+          <w:ilvl w:val="0"/>
+          <w:numId w:val="18"/>
+        </w:numPr>
+        <w:rPr>
+          <w:lang w:val="en-NG"/>
+        </w:rPr>
+      </w:pPr>
+      <w:r>
+        <w:rPr>
+          <w:lang w:val="en-NG"/>
+        </w:rPr>
+        <w:t xml:space="preserve">All Currencies view</w:t>
+      </w:r>
+    </w:p>
+    <w:p>
+      <w:pPr>
+        <w:numPr>
+          <w:ilvl w:val="0"/>
+          <w:numId w:val="18"/>
+        </w:numPr>
+        <w:rPr>
+          <w:lang w:val="en-NG"/>
+        </w:rPr>
+      </w:pPr>
+      <w:r>
+        <w:rPr>
+          <w:lang w:val="en-NG"/>
+        </w:rPr>
+        <w:t xml:space="preserve">Basic currency conversion for consolidated reporting</w:t>
+      </w:r>
+    </w:p>
+    <w:p>
+      <w:pPr>
+        <w:rPr>
+          <w:lang w:val="en-NG"/>
+        </w:rPr>
+      </w:pPr>
+      <w:r>
+        <w:rPr>
+          <w:lang w:val="en-NG"/>
+        </w:rPr>
+        <w:t xml:space="preserve">Note: Advanced currency features, such as automatic live exchange rates, are not required for the MVP.</w:t>
+      </w:r>
+    </w:p>
+    <w:p>
+      <w:pPr>
         <w:rPr>
           <w:lang w:val="en-NG"/>
         </w:rPr>
@@ -5264,6 +5932,40 @@
     </w:p>
     <w:p>
       <w:pPr>
+        <w:numPr>
+          <w:ilvl w:val="0"/>
+          <w:numId w:val="19"/>
+        </w:numPr>
+        <w:rPr>
+          <w:lang w:val="en-NG"/>
+        </w:rPr>
+      </w:pPr>
+      <w:r>
+        <w:rPr>
+          <w:lang w:val="en-NG"/>
+        </w:rPr>
+        <w:t xml:space="preserve">Automatic live exchange rates</w:t>
+      </w:r>
+    </w:p>
+    <w:p>
+      <w:pPr>
+        <w:numPr>
+          <w:ilvl w:val="0"/>
+          <w:numId w:val="19"/>
+        </w:numPr>
+        <w:rPr>
+          <w:lang w:val="en-NG"/>
+        </w:rPr>
+      </w:pPr>
+      <w:r>
+        <w:rPr>
+          <w:lang w:val="en-NG"/>
+        </w:rPr>
+        <w:t xml:space="preserve">Automatic money conversion preferences</w:t>
+      </w:r>
+    </w:p>
+    <w:p>
+      <w:pPr>
         <w:rPr>
           <w:lang w:val="en-NG"/>
         </w:rPr>
@@ -5468,6 +6170,23 @@
     </w:p>
     <w:p>
       <w:pPr>
+        <w:numPr>
+          <w:ilvl w:val="0"/>
+          <w:numId w:val="20"/>
+        </w:numPr>
+        <w:rPr>
+          <w:lang w:val="en-NG"/>
+        </w:rPr>
+      </w:pPr>
+      <w:r>
+        <w:rPr>
+          <w:lang w:val="en-NG"/>
+        </w:rPr>
+        <w:t xml:space="preserve">Users managing money across multiple currencies.</w:t>
+      </w:r>
+    </w:p>
+    <w:p>
+      <w:pPr>
         <w:rPr>
           <w:lang w:val="en-NG"/>
         </w:rPr>
@@ -5529,7 +6248,7 @@
         <w:rPr>
           <w:lang w:val="en-NG"/>
         </w:rPr>
-        <w:t xml:space="preserve"> Create an account.</w:t>
+        <w:t xml:space="preserve"> Create an account and choose a primary currency.</w:t>
       </w:r>
     </w:p>
     <w:p>
@@ -5862,6 +6581,19 @@
         <w:rPr>
           <w:lang w:val="en-NG"/>
         </w:rPr>
+        <w:t xml:space="preserve">MYNAIRATRACK remains a Nigeria-first product. Multi-currency support allows users outside Nigeria, or users who earn and spend in multiple currencies, to also use the product, but Nigeria remains the initial primary market.</w:t>
+      </w:r>
+    </w:p>
+    <w:p>
+      <w:pPr>
+        <w:rPr>
+          <w:lang w:val="en-NG"/>
+        </w:rPr>
+      </w:pPr>
+      <w:r>
+        <w:rPr>
+          <w:lang w:val="en-NG"/>
+        </w:rPr>
         <w:pict w14:anchorId="0FCAC0CF">
           <v:rect id="_x0000_i1219" style="width:0;height:1.5pt" o:hralign="center" o:hrstd="t" o:hr="t" fillcolor="#a0a0a0" stroked="f"/>
         </w:pict>
@@ -5950,6 +6682,19 @@
         <w:rPr>
           <w:lang w:val="en-NG"/>
         </w:rPr>
+        <w:t xml:space="preserve">The "NAIRA" identity represents the product's Nigerian-first origin and positioning. It does not restrict the app to only Nigerian Naira; MYNAIRATRACK supports multiple currencies while keeping this identity.</w:t>
+      </w:r>
+    </w:p>
+    <w:p>
+      <w:pPr>
+        <w:rPr>
+          <w:lang w:val="en-NG"/>
+        </w:rPr>
+      </w:pPr>
+      <w:r>
+        <w:rPr>
+          <w:lang w:val="en-NG"/>
+        </w:rPr>
         <w:t>The brand can eventually expand beyond basic expense tracking into broader personal and small-business financial management while maintaining the MYNAIRATRACK identity.</w:t>
       </w:r>
     </w:p>
@@ -6023,6 +6768,19 @@
         <w:rPr>
           <w:lang w:val="en-NG"/>
         </w:rPr>
+        <w:t xml:space="preserve">Multi-currency support runs across these areas: income, expenses, budgets, savings, financial goals, and business finance.</w:t>
+      </w:r>
+    </w:p>
+    <w:p>
+      <w:pPr>
+        <w:rPr>
+          <w:lang w:val="en-NG"/>
+        </w:rPr>
+      </w:pPr>
+      <w:r>
+        <w:rPr>
+          <w:lang w:val="en-NG"/>
+        </w:rPr>
         <w:t xml:space="preserve">The product's key differentiator should be its combination of </w:t>
       </w:r>
       <w:r>
@@ -6031,7 +6789,7 @@
           <w:bCs/>
           <w:lang w:val="en-NG"/>
         </w:rPr>
-        <w:t>flexible budgeting, simple transaction tracking, clear financial visibility, and optional business finance management</w:t>
+        <w:t>flexible budgeting, simple transaction tracking, clear financial visibility, optional business finance management, and multi-currency support</w:t>
       </w:r>
       <w:r>
         <w:rPr>

</xml_diff>

<commit_message>
Fix truncated currency example paragraphs in updated PRD
</commit_message>
<xml_diff>
--- a/MYNAIRATRACK 001-PRODUCT REQUIREMENTS DOCUMENT.docx
+++ b/MYNAIRATRACK 001-PRODUCT REQUIREMENTS DOCUMENT.docx
@@ -2317,7 +2317,7 @@
         <w:rPr>
           <w:lang w:val="en-NG"/>
         </w:rPr>
-        <w:t xml:space="preserve">Each income record should also capture the relevant currency. For example: Salary - â</w:t>
+        <w:t xml:space="preserve">Each income record should also capture the relevant currency. For example: Salary - ₦300,000 NGN, Freelance income - $500 USD.</w:t>
       </w:r>
     </w:p>
     <w:p>
@@ -2627,6 +2627,19 @@
         <w:rPr>
           <w:lang w:val="en-NG"/>
         </w:rPr>
+        <w:t xml:space="preserve">Each expense record should also capture its currency, and the original currency and amount of every transaction must be retained. For example: -$20 USD for a software expense, or -₦30,000 NGN for food.</w:t>
+      </w:r>
+    </w:p>
+    <w:p>
+      <w:pPr>
+        <w:rPr>
+          <w:lang w:val="en-NG"/>
+        </w:rPr>
+      </w:pPr>
+      <w:r>
+        <w:rPr>
+          <w:lang w:val="en-NG"/>
+        </w:rPr>
         <w:pict w14:anchorId="6BA1031B">
           <v:rect id="_x0000_i1203" style="width:0;height:1.5pt" o:hralign="center" o:hrstd="t" o:hr="t" fillcolor="#a0a0a0" stroked="f"/>
         </w:pict>
@@ -4352,7 +4365,46 @@
         <w:rPr>
           <w:lang w:val="en-NG"/>
         </w:rPr>
-        <w:t xml:space="preserve">Salary: +â</w:t>
+        <w:t xml:space="preserve">Salary: +₦500,000 NGN</w:t>
+      </w:r>
+    </w:p>
+    <w:p>
+      <w:pPr>
+        <w:rPr>
+          <w:lang w:val="en-NG"/>
+        </w:rPr>
+      </w:pPr>
+      <w:r>
+        <w:rPr>
+          <w:lang w:val="en-NG"/>
+        </w:rPr>
+        <w:t xml:space="preserve">Freelance income: +$500 USD</w:t>
+      </w:r>
+    </w:p>
+    <w:p>
+      <w:pPr>
+        <w:rPr>
+          <w:lang w:val="en-NG"/>
+        </w:rPr>
+      </w:pPr>
+      <w:r>
+        <w:rPr>
+          <w:lang w:val="en-NG"/>
+        </w:rPr>
+        <w:t xml:space="preserve">Software expense: -$20 USD</w:t>
+      </w:r>
+    </w:p>
+    <w:p>
+      <w:pPr>
+        <w:rPr>
+          <w:lang w:val="en-NG"/>
+        </w:rPr>
+      </w:pPr>
+      <w:r>
+        <w:rPr>
+          <w:lang w:val="en-NG"/>
+        </w:rPr>
+        <w:t xml:space="preserve">Food expense: -₦30,000 NGN</w:t>
       </w:r>
     </w:p>
     <w:p>

</xml_diff>

<commit_message>
Apply PRD corrections: guided budget currency, MVP currency list, currency concepts, cross-currency budget rule, primary currency change behavior, examples
</commit_message>
<xml_diff>
--- a/MYNAIRATRACK 001-PRODUCT REQUIREMENTS DOCUMENT.docx
+++ b/MYNAIRATRACK 001-PRODUCT REQUIREMENTS DOCUMENT.docx
@@ -142,7 +142,7 @@
         <w:rPr>
           <w:lang w:val="en-NG"/>
         </w:rPr>
-        <w:t xml:space="preserve">NGN (users can choose their own primary currency)</w:t>
+        <w:t xml:space="preserve">NGN by default; user-selectable.</w:t>
       </w:r>
     </w:p>
     <w:p>
@@ -2330,6 +2330,19 @@
         <w:rPr>
           <w:lang w:val="en-NG"/>
         </w:rPr>
+        <w:t xml:space="preserve">When recording an income or expense, the user should be able to select the currency of the transaction from the supported currencies when necessary. The original transaction amount and currency must always be preserved.</w:t>
+      </w:r>
+    </w:p>
+    <w:p>
+      <w:pPr>
+        <w:rPr>
+          <w:lang w:val="en-NG"/>
+        </w:rPr>
+      </w:pPr>
+      <w:r>
+        <w:rPr>
+          <w:lang w:val="en-NG"/>
+        </w:rPr>
         <w:pict w14:anchorId="652F88D3">
           <v:rect id="_x0000_i1202" style="width:0;height:1.5pt" o:hralign="center" o:hrstd="t" o:hr="t" fillcolor="#a0a0a0" stroked="f"/>
         </w:pict>
@@ -2627,7 +2640,7 @@
         <w:rPr>
           <w:lang w:val="en-NG"/>
         </w:rPr>
-        <w:t xml:space="preserve">Each expense record should also capture its currency, and the original currency and amount of every transaction must be retained. For example: -$20 USD for a software expense, or -₦30,000 NGN for food.</w:t>
+        <w:t xml:space="preserve">Each expense record should also capture its currency, and the original currency and amount of every transaction must be retained. For example: -$20 USD for a software expense, or -+₦30,000 NGN for food.</w:t>
       </w:r>
     </w:p>
     <w:p>
@@ -2879,6 +2892,19 @@
         <w:rPr>
           <w:lang w:val="en-NG"/>
         </w:rPr>
+        <w:t xml:space="preserve">For the MVP, an expense should count toward a budget only when the expense and the budget use the same currency. Cross-currency budget conversion is not required in the MVP.</w:t>
+      </w:r>
+    </w:p>
+    <w:p>
+      <w:pPr>
+        <w:rPr>
+          <w:lang w:val="en-NG"/>
+        </w:rPr>
+      </w:pPr>
+      <w:r>
+        <w:rPr>
+          <w:lang w:val="en-NG"/>
+        </w:rPr>
         <w:pict w14:anchorId="1B0117B3">
           <v:rect id="_x0000_i1204" style="width:0;height:1.5pt" o:hralign="center" o:hrstd="t" o:hr="t" fillcolor="#a0a0a0" stroked="f"/>
         </w:pict>
@@ -3086,6 +3112,19 @@
         <w:rPr>
           <w:lang w:val="en-NG"/>
         </w:rPr>
+        <w:t xml:space="preserve">A guided budget uses the currency selected for that specific budget. The user's primary currency may be the default, but the user can choose another supported currency.</w:t>
+      </w:r>
+    </w:p>
+    <w:p>
+      <w:pPr>
+        <w:rPr>
+          <w:lang w:val="en-NG"/>
+        </w:rPr>
+      </w:pPr>
+      <w:r>
+        <w:rPr>
+          <w:lang w:val="en-NG"/>
+        </w:rPr>
         <w:pict w14:anchorId="13F6EF4B">
           <v:rect id="_x0000_i1205" style="width:0;height:1.5pt" o:hralign="center" o:hrstd="t" o:hr="t" fillcolor="#a0a0a0" stroked="f"/>
         </w:pict>
@@ -3619,7 +3658,7 @@
         <w:rPr>
           <w:lang w:val="en-NG"/>
         </w:rPr>
-        <w:t xml:space="preserve">Savings should be tracked in the relevant currency, and a savings target should be set in a specific currency.</w:t>
+        <w:t xml:space="preserve">Savings should each have their own currency. A user does not need to have an account/wallet in that currency in order to set a savings target.</w:t>
       </w:r>
     </w:p>
     <w:p>
@@ -3982,7 +4021,7 @@
         <w:rPr>
           <w:lang w:val="en-NG"/>
         </w:rPr>
-        <w:t xml:space="preserve">Each financial goal should have its target amount in a specific currency.</w:t>
+        <w:t xml:space="preserve">Each financial goal should have its target amount in a specific currency. A user does not need to have an account/wallet in that currency in order to create a financial goal.</w:t>
       </w:r>
     </w:p>
     <w:p>
@@ -4326,7 +4365,20 @@
         <w:rPr>
           <w:lang w:val="en-NG"/>
         </w:rPr>
-        <w:t xml:space="preserve">Users should be able to add and use additional supported currencies. For example, a user whose primary currency is NGN could also add USD and EUR.</w:t>
+        <w:t xml:space="preserve">If a user changes their primary currency, their dashboard and consolidated financial overview should use the newly selected primary currency. Existing transaction currencies, account/wallet currencies, budget currencies, and savings/goal currencies must not change, and changing the primary currency must not rewrite historical financial records.</w:t>
+      </w:r>
+    </w:p>
+    <w:p>
+      <w:pPr>
+        <w:rPr>
+          <w:lang w:val="en-NG"/>
+        </w:rPr>
+      </w:pPr>
+      <w:r>
+        <w:rPr>
+          <w:lang w:val="en-NG"/>
+        </w:rPr>
+        <w:t xml:space="preserve">For the initial MVP, supported currencies are NGN (Nigerian Naira), USD (US Dollar), EUR (Euro), and GBP (British Pound). Additional currencies can be supported in the future.</w:t>
       </w:r>
     </w:p>
     <w:p>
@@ -4488,6 +4540,101 @@
     <w:p>
       <w:pPr>
         <w:rPr>
+          <w:b/>
+          <w:bCs/>
+          <w:lang w:val="en-NG"/>
+        </w:rPr>
+      </w:pPr>
+      <w:r>
+        <w:rPr>
+          <w:b/>
+          <w:bCs/>
+          <w:lang w:val="en-NG"/>
+        </w:rPr>
+        <w:t xml:space="preserve">Currency Concepts</w:t>
+      </w:r>
+    </w:p>
+    <w:p>
+      <w:pPr>
+        <w:rPr>
+          <w:lang w:val="en-NG"/>
+        </w:rPr>
+      </w:pPr>
+      <w:r>
+        <w:rPr>
+          <w:lang w:val="en-NG"/>
+        </w:rPr>
+        <w:t xml:space="preserve">Primary currency = the user's main dashboard and consolidated reporting currency.</w:t>
+      </w:r>
+    </w:p>
+    <w:p>
+      <w:pPr>
+        <w:rPr>
+          <w:lang w:val="en-NG"/>
+        </w:rPr>
+      </w:pPr>
+      <w:r>
+        <w:rPr>
+          <w:lang w:val="en-NG"/>
+        </w:rPr>
+        <w:t xml:space="preserve">Account/wallet currency = the currency associated with a specific account or wallet.</w:t>
+      </w:r>
+    </w:p>
+    <w:p>
+      <w:pPr>
+        <w:rPr>
+          <w:lang w:val="en-NG"/>
+        </w:rPr>
+      </w:pPr>
+      <w:r>
+        <w:rPr>
+          <w:lang w:val="en-NG"/>
+        </w:rPr>
+        <w:t xml:space="preserve">Transaction currency = the original currency in which an income or expense was recorded.</w:t>
+      </w:r>
+    </w:p>
+    <w:p>
+      <w:pPr>
+        <w:rPr>
+          <w:lang w:val="en-NG"/>
+        </w:rPr>
+      </w:pPr>
+      <w:r>
+        <w:rPr>
+          <w:lang w:val="en-NG"/>
+        </w:rPr>
+        <w:t xml:space="preserve">Budget currency = the currency in which a specific budget is created.</w:t>
+      </w:r>
+    </w:p>
+    <w:p>
+      <w:pPr>
+        <w:rPr>
+          <w:lang w:val="en-NG"/>
+        </w:rPr>
+      </w:pPr>
+      <w:r>
+        <w:rPr>
+          <w:lang w:val="en-NG"/>
+        </w:rPr>
+        <w:t xml:space="preserve">Goal/savings currency = the currency in which a savings target or goal is denominated.</w:t>
+      </w:r>
+    </w:p>
+    <w:p>
+      <w:pPr>
+        <w:rPr>
+          <w:lang w:val="en-NG"/>
+        </w:rPr>
+      </w:pPr>
+      <w:r>
+        <w:rPr>
+          <w:lang w:val="en-NG"/>
+        </w:rPr>
+        <w:t xml:space="preserve">All Currencies = a consolidated financial view presented using the user's primary currency.</w:t>
+      </w:r>
+    </w:p>
+    <w:p>
+      <w:pPr>
+        <w:rPr>
           <w:lang w:val="en-NG"/>
         </w:rPr>
       </w:pPr>
@@ -4496,6 +4643,19 @@
           <w:lang w:val="en-NG"/>
         </w:rPr>
         <w:t xml:space="preserve">MYNAIRATRACK can display converted equivalents for consolidated financial views. The PRD does not specify how exchange rates are obtained, calculated, or technically implemented.</w:t>
+      </w:r>
+    </w:p>
+    <w:p>
+      <w:pPr>
+        <w:rPr>
+          <w:lang w:val="en-NG"/>
+        </w:rPr>
+      </w:pPr>
+      <w:r>
+        <w:rPr>
+          <w:lang w:val="en-NG"/>
+        </w:rPr>
+        <w:t xml:space="preserve">Amounts in different currencies should not be added together directly; conversion should be used for any combined or consolidated financial view.</w:t>
       </w:r>
     </w:p>
     <w:p>

</xml_diff>